<commit_message>
Add JavaFX installation verification screenshots
</commit_message>
<xml_diff>
--- a/Cortez_Module1.2_CSD402.docx
+++ b/Cortez_Module1.2_CSD402.docx
@@ -60,6 +60,9 @@
     </w:p>
     <w:p>
       <w:r>
+        <w:rPr>
+          <w:noProof/>
+        </w:rPr>
         <w:drawing>
           <wp:inline distT="0" distB="0" distL="0" distR="0" wp14:anchorId="134367E6" wp14:editId="322434AB">
             <wp:extent cx="5943600" cy="1982470"/>
@@ -136,6 +139,9 @@
     </w:p>
     <w:p>
       <w:r>
+        <w:rPr>
+          <w:noProof/>
+        </w:rPr>
         <w:drawing>
           <wp:inline distT="0" distB="0" distL="0" distR="0" wp14:anchorId="3681FF73" wp14:editId="308E580C">
             <wp:extent cx="5943600" cy="2216150"/>
@@ -182,6 +188,118 @@
         </w:drawing>
       </w:r>
     </w:p>
+    <w:p/>
+    <w:p/>
+    <w:p>
+      <w:pPr>
+        <w:pStyle w:val="ListParagraph"/>
+        <w:numPr>
+          <w:ilvl w:val="0"/>
+          <w:numId w:val="1"/>
+        </w:numPr>
+      </w:pPr>
+      <w:r>
+        <w:t>JavaFX Installation and Configuration Verification</w:t>
+      </w:r>
+    </w:p>
+    <w:p>
+      <w:r>
+        <w:drawing>
+          <wp:inline distT="0" distB="0" distL="0" distR="0" wp14:anchorId="686E5633" wp14:editId="29AAEF9B">
+            <wp:extent cx="5943600" cy="3210560"/>
+            <wp:effectExtent l="0" t="0" r="0" b="8890"/>
+            <wp:docPr id="662596192" name="Picture 1"/>
+            <wp:cNvGraphicFramePr>
+              <a:graphicFrameLocks xmlns:a="http://schemas.openxmlformats.org/drawingml/2006/main" noChangeAspect="1"/>
+            </wp:cNvGraphicFramePr>
+            <a:graphic xmlns:a="http://schemas.openxmlformats.org/drawingml/2006/main">
+              <a:graphicData uri="http://schemas.openxmlformats.org/drawingml/2006/picture">
+                <pic:pic xmlns:pic="http://schemas.openxmlformats.org/drawingml/2006/picture">
+                  <pic:nvPicPr>
+                    <pic:cNvPr id="662596192" name=""/>
+                    <pic:cNvPicPr/>
+                  </pic:nvPicPr>
+                  <pic:blipFill>
+                    <a:blip r:embed="rId8"/>
+                    <a:stretch>
+                      <a:fillRect/>
+                    </a:stretch>
+                  </pic:blipFill>
+                  <pic:spPr>
+                    <a:xfrm>
+                      <a:off x="0" y="0"/>
+                      <a:ext cx="5943600" cy="3210560"/>
+                    </a:xfrm>
+                    <a:prstGeom prst="rect">
+                      <a:avLst/>
+                    </a:prstGeom>
+                  </pic:spPr>
+                </pic:pic>
+              </a:graphicData>
+            </a:graphic>
+          </wp:inline>
+        </w:drawing>
+      </w:r>
+    </w:p>
+    <w:p/>
+    <w:p/>
+    <w:p/>
+    <w:p/>
+    <w:p>
+      <w:r>
+        <w:lastRenderedPageBreak/>
+        <w:t xml:space="preserve">Figure 5. </w:t>
+      </w:r>
+      <w:proofErr w:type="gramStart"/>
+      <w:r>
+        <w:t>NetBeans</w:t>
+      </w:r>
+      <w:proofErr w:type="gramEnd"/>
+      <w:r>
+        <w:t xml:space="preserve"> output confirming the JavaFX test completed successfully with BUILD SUCCESSFUL.</w:t>
+      </w:r>
+    </w:p>
+    <w:p/>
+    <w:p>
+      <w:r>
+        <w:drawing>
+          <wp:inline distT="0" distB="0" distL="0" distR="0" wp14:anchorId="30A8626D" wp14:editId="501168B4">
+            <wp:extent cx="5943600" cy="3191510"/>
+            <wp:effectExtent l="0" t="0" r="0" b="8890"/>
+            <wp:docPr id="1428957733" name="Picture 1"/>
+            <wp:cNvGraphicFramePr>
+              <a:graphicFrameLocks xmlns:a="http://schemas.openxmlformats.org/drawingml/2006/main" noChangeAspect="1"/>
+            </wp:cNvGraphicFramePr>
+            <a:graphic xmlns:a="http://schemas.openxmlformats.org/drawingml/2006/main">
+              <a:graphicData uri="http://schemas.openxmlformats.org/drawingml/2006/picture">
+                <pic:pic xmlns:pic="http://schemas.openxmlformats.org/drawingml/2006/picture">
+                  <pic:nvPicPr>
+                    <pic:cNvPr id="1428957733" name=""/>
+                    <pic:cNvPicPr/>
+                  </pic:nvPicPr>
+                  <pic:blipFill>
+                    <a:blip r:embed="rId9"/>
+                    <a:stretch>
+                      <a:fillRect/>
+                    </a:stretch>
+                  </pic:blipFill>
+                  <pic:spPr>
+                    <a:xfrm>
+                      <a:off x="0" y="0"/>
+                      <a:ext cx="5943600" cy="3191510"/>
+                    </a:xfrm>
+                    <a:prstGeom prst="rect">
+                      <a:avLst/>
+                    </a:prstGeom>
+                  </pic:spPr>
+                </pic:pic>
+              </a:graphicData>
+            </a:graphic>
+          </wp:inline>
+        </w:drawing>
+      </w:r>
+    </w:p>
+    <w:p/>
     <w:p/>
     <w:p/>
     <w:sectPr>

</xml_diff>